<commit_message>
live production final commit for Phase 1
</commit_message>
<xml_diff>
--- a/GCCWebApp/docs/user-guide/GCC_Administrator_Guide_v1.0.docx
+++ b/GCCWebApp/docs/user-guide/GCC_Administrator_Guide_v1.0.docx
@@ -2784,6 +2784,26 @@
       </w:r>
     </w:p>
     <w:p>
+      <w:r>
+        <w:rPr>
+          <w:b w:val="0"/>
+        </w:rPr>
+        <w:t xml:space="preserve">The site also serves a </w:t>
+      </w:r>
+      <w:r>
+        <w:rPr>
+          <w:b/>
+        </w:rPr>
+        <w:t>Privacy Policy</w:t>
+      </w:r>
+      <w:r>
+        <w:rPr>
+          <w:b w:val="0"/>
+        </w:rPr>
+        <w:t xml:space="preserve"> page, linked from the footer. It is maintained as a single document outside the running application and is not editable from these screens — to change its wording, contact whoever maintains the site.</w:t>
+      </w:r>
+    </w:p>
+    <w:p>
       <w:pPr>
         <w:pStyle w:val="Heading1"/>
       </w:pPr>
@@ -3449,11 +3469,16 @@
       </w:pPr>
     </w:p>
     <w:p>
+      <w:r>
+        <w:br w:type="page"/>
+      </w:r>
+    </w:p>
+    <w:p>
       <w:pPr>
         <w:pStyle w:val="Heading1"/>
       </w:pPr>
       <w:r>
-        <w:t>Appendix A — What each role can see</w:t>
+        <w:t>What each role can see</w:t>
       </w:r>
     </w:p>
     <w:tbl>
@@ -3474,7 +3499,7 @@
       <w:tr>
         <w:tc>
           <w:tcPr>
-            <w:tcW w:type="dxa" w:w="2160"/>
+            <w:tcW w:type="dxa" w:w="2189"/>
           </w:tcPr>
           <w:p>
             <w:r/>
@@ -3542,13 +3567,13 @@
                 <w:b/>
                 <w:sz w:val="18"/>
               </w:rPr>
-              <w:t>External</w:t>
+              <w:t>Company</w:t>
             </w:r>
           </w:p>
         </w:tc>
         <w:tc>
           <w:tcPr>
-            <w:tcW w:type="dxa" w:w="1282"/>
+            <w:tcW w:type="dxa" w:w="1267"/>
           </w:tcPr>
           <w:p>
             <w:r/>
@@ -3565,7 +3590,7 @@
       <w:tr>
         <w:tc>
           <w:tcPr>
-            <w:tcW w:type="dxa" w:w="2160"/>
+            <w:tcW w:type="dxa" w:w="2189"/>
           </w:tcPr>
           <w:p>
             <w:r/>
@@ -3640,7 +3665,7 @@
         </w:tc>
         <w:tc>
           <w:tcPr>
-            <w:tcW w:type="dxa" w:w="1282"/>
+            <w:tcW w:type="dxa" w:w="1267"/>
           </w:tcPr>
           <w:p>
             <w:r/>
@@ -3657,7 +3682,7 @@
       <w:tr>
         <w:tc>
           <w:tcPr>
-            <w:tcW w:type="dxa" w:w="2160"/>
+            <w:tcW w:type="dxa" w:w="2189"/>
           </w:tcPr>
           <w:p>
             <w:r/>
@@ -3732,7 +3757,7 @@
         </w:tc>
         <w:tc>
           <w:tcPr>
-            <w:tcW w:type="dxa" w:w="1282"/>
+            <w:tcW w:type="dxa" w:w="1267"/>
           </w:tcPr>
           <w:p>
             <w:r/>
@@ -3749,7 +3774,7 @@
       <w:tr>
         <w:tc>
           <w:tcPr>
-            <w:tcW w:type="dxa" w:w="2160"/>
+            <w:tcW w:type="dxa" w:w="2189"/>
           </w:tcPr>
           <w:p>
             <w:r/>
@@ -3824,7 +3849,7 @@
         </w:tc>
         <w:tc>
           <w:tcPr>
-            <w:tcW w:type="dxa" w:w="1282"/>
+            <w:tcW w:type="dxa" w:w="1267"/>
           </w:tcPr>
           <w:p>
             <w:r/>
@@ -3841,7 +3866,7 @@
       <w:tr>
         <w:tc>
           <w:tcPr>
-            <w:tcW w:type="dxa" w:w="2160"/>
+            <w:tcW w:type="dxa" w:w="2189"/>
           </w:tcPr>
           <w:p>
             <w:r/>
@@ -3916,7 +3941,7 @@
         </w:tc>
         <w:tc>
           <w:tcPr>
-            <w:tcW w:type="dxa" w:w="1282"/>
+            <w:tcW w:type="dxa" w:w="1267"/>
           </w:tcPr>
           <w:p>
             <w:r/>
@@ -3933,7 +3958,7 @@
       <w:tr>
         <w:tc>
           <w:tcPr>
-            <w:tcW w:type="dxa" w:w="2160"/>
+            <w:tcW w:type="dxa" w:w="2189"/>
           </w:tcPr>
           <w:p>
             <w:r/>
@@ -4008,7 +4033,7 @@
         </w:tc>
         <w:tc>
           <w:tcPr>
-            <w:tcW w:type="dxa" w:w="1282"/>
+            <w:tcW w:type="dxa" w:w="1267"/>
           </w:tcPr>
           <w:p>
             <w:r/>
@@ -4025,7 +4050,7 @@
       <w:tr>
         <w:tc>
           <w:tcPr>
-            <w:tcW w:type="dxa" w:w="2160"/>
+            <w:tcW w:type="dxa" w:w="2189"/>
           </w:tcPr>
           <w:p>
             <w:r/>
@@ -4034,7 +4059,7 @@
                 <w:b w:val="0"/>
                 <w:sz w:val="19"/>
               </w:rPr>
-              <w:t>Bulk import and undo</w:t>
+              <w:t>Bulk import, and undo an import</w:t>
             </w:r>
           </w:p>
         </w:tc>
@@ -4100,7 +4125,7 @@
         </w:tc>
         <w:tc>
           <w:tcPr>
-            <w:tcW w:type="dxa" w:w="1282"/>
+            <w:tcW w:type="dxa" w:w="1267"/>
           </w:tcPr>
           <w:p>
             <w:r/>
@@ -4117,7 +4142,7 @@
       <w:tr>
         <w:tc>
           <w:tcPr>
-            <w:tcW w:type="dxa" w:w="2160"/>
+            <w:tcW w:type="dxa" w:w="2189"/>
           </w:tcPr>
           <w:p>
             <w:r/>
@@ -4192,7 +4217,7 @@
         </w:tc>
         <w:tc>
           <w:tcPr>
-            <w:tcW w:type="dxa" w:w="1282"/>
+            <w:tcW w:type="dxa" w:w="1267"/>
           </w:tcPr>
           <w:p>
             <w:r/>
@@ -4209,7 +4234,7 @@
       <w:tr>
         <w:tc>
           <w:tcPr>
-            <w:tcW w:type="dxa" w:w="2160"/>
+            <w:tcW w:type="dxa" w:w="2189"/>
           </w:tcPr>
           <w:p>
             <w:r/>
@@ -4284,7 +4309,7 @@
         </w:tc>
         <w:tc>
           <w:tcPr>
-            <w:tcW w:type="dxa" w:w="1282"/>
+            <w:tcW w:type="dxa" w:w="1267"/>
           </w:tcPr>
           <w:p>
             <w:r/>
@@ -4301,7 +4326,7 @@
       <w:tr>
         <w:tc>
           <w:tcPr>
-            <w:tcW w:type="dxa" w:w="2160"/>
+            <w:tcW w:type="dxa" w:w="2189"/>
           </w:tcPr>
           <w:p>
             <w:r/>
@@ -4376,7 +4401,7 @@
         </w:tc>
         <w:tc>
           <w:tcPr>
-            <w:tcW w:type="dxa" w:w="1282"/>
+            <w:tcW w:type="dxa" w:w="1267"/>
           </w:tcPr>
           <w:p>
             <w:r/>
@@ -4401,7 +4426,1106 @@
         <w:rPr>
           <w:b w:val="0"/>
         </w:rPr>
-        <w:t>Confidential certificates are visible to Admin, Analyst, the owning company and its associated partners — and withheld from the public directory only.</w:t>
+        <w:t>Confidential certificates are visible to Admin, Analyst, the owning company and that company's associated partners. They are withheld from the public directory only.</w:t>
+      </w:r>
+    </w:p>
+    <w:p>
+      <w:r>
+        <w:rPr>
+          <w:b w:val="0"/>
+        </w:rPr>
+        <w:t>A certificate that has not reached its effective date behaves differently by audience: the owning company sees it in their own list straight away, while the public directory and the partner feed wait for the effective date to arrive.</w:t>
+      </w:r>
+    </w:p>
+    <w:p>
+      <w:pPr>
+        <w:pStyle w:val="Heading1"/>
+      </w:pPr>
+      <w:r>
+        <w:t>Glossary</w:t>
+      </w:r>
+    </w:p>
+    <w:tbl>
+      <w:tblPr>
+        <w:tblStyle w:val="LightGrid-Accent3"/>
+        <w:tblW w:type="auto" w:w="0"/>
+        <w:jc w:val="left"/>
+        <w:tblLook w:firstColumn="1" w:firstRow="1" w:lastColumn="0" w:lastRow="0" w:noHBand="0" w:noVBand="1" w:val="04A0"/>
+      </w:tblPr>
+      <w:tblGrid>
+        <w:gridCol w:w="4680"/>
+        <w:gridCol w:w="4680"/>
+      </w:tblGrid>
+      <w:tr>
+        <w:tc>
+          <w:tcPr>
+            <w:tcW w:type="dxa" w:w="2045"/>
+          </w:tcPr>
+          <w:p>
+            <w:r/>
+            <w:r>
+              <w:rPr>
+                <w:b/>
+                <w:sz w:val="18"/>
+              </w:rPr>
+              <w:t>Term</w:t>
+            </w:r>
+          </w:p>
+        </w:tc>
+        <w:tc>
+          <w:tcPr>
+            <w:tcW w:type="dxa" w:w="6595"/>
+          </w:tcPr>
+          <w:p>
+            <w:r/>
+            <w:r>
+              <w:rPr>
+                <w:b/>
+                <w:sz w:val="18"/>
+              </w:rPr>
+              <w:t>Meaning</w:t>
+            </w:r>
+          </w:p>
+        </w:tc>
+      </w:tr>
+      <w:tr>
+        <w:tc>
+          <w:tcPr>
+            <w:tcW w:type="dxa" w:w="2045"/>
+          </w:tcPr>
+          <w:p>
+            <w:r/>
+            <w:r>
+              <w:rPr>
+                <w:b/>
+                <w:sz w:val="19"/>
+              </w:rPr>
+              <w:t>Admin</w:t>
+            </w:r>
+          </w:p>
+        </w:tc>
+        <w:tc>
+          <w:tcPr>
+            <w:tcW w:type="dxa" w:w="6595"/>
+          </w:tcPr>
+          <w:p>
+            <w:r/>
+            <w:r>
+              <w:rPr>
+                <w:b w:val="0"/>
+                <w:sz w:val="19"/>
+              </w:rPr>
+              <w:t>Internal role with full access, including the Administration menu. Administrator accounts cannot be deleted</w:t>
+            </w:r>
+          </w:p>
+        </w:tc>
+      </w:tr>
+      <w:tr>
+        <w:tc>
+          <w:tcPr>
+            <w:tcW w:type="dxa" w:w="2045"/>
+          </w:tcPr>
+          <w:p>
+            <w:r/>
+            <w:r>
+              <w:rPr>
+                <w:b/>
+                <w:sz w:val="19"/>
+              </w:rPr>
+              <w:t>Analyst</w:t>
+            </w:r>
+          </w:p>
+        </w:tc>
+        <w:tc>
+          <w:tcPr>
+            <w:tcW w:type="dxa" w:w="6595"/>
+          </w:tcPr>
+          <w:p>
+            <w:r/>
+            <w:r>
+              <w:rPr>
+                <w:b w:val="0"/>
+                <w:sz w:val="19"/>
+              </w:rPr>
+              <w:t>Internal role that operates the certificate work day to day — create, edit, import, export. No Administration menu</w:t>
+            </w:r>
+          </w:p>
+        </w:tc>
+      </w:tr>
+      <w:tr>
+        <w:tc>
+          <w:tcPr>
+            <w:tcW w:type="dxa" w:w="2045"/>
+          </w:tcPr>
+          <w:p>
+            <w:r/>
+            <w:r>
+              <w:rPr>
+                <w:b/>
+                <w:sz w:val="19"/>
+              </w:rPr>
+              <w:t>ASIN</w:t>
+            </w:r>
+          </w:p>
+        </w:tc>
+        <w:tc>
+          <w:tcPr>
+            <w:tcW w:type="dxa" w:w="6595"/>
+          </w:tcPr>
+          <w:p>
+            <w:r/>
+            <w:r>
+              <w:rPr>
+                <w:b w:val="0"/>
+                <w:sz w:val="19"/>
+              </w:rPr>
+              <w:t>Amazon Standard Identification Number, the identifier Amazon uses for a product</w:t>
+            </w:r>
+          </w:p>
+        </w:tc>
+      </w:tr>
+      <w:tr>
+        <w:tc>
+          <w:tcPr>
+            <w:tcW w:type="dxa" w:w="2045"/>
+          </w:tcPr>
+          <w:p>
+            <w:r/>
+            <w:r>
+              <w:rPr>
+                <w:b/>
+                <w:sz w:val="19"/>
+              </w:rPr>
+              <w:t>Badgeable</w:t>
+            </w:r>
+          </w:p>
+        </w:tc>
+        <w:tc>
+          <w:tcPr>
+            <w:tcW w:type="dxa" w:w="6595"/>
+          </w:tcPr>
+          <w:p>
+            <w:r/>
+            <w:r>
+              <w:rPr>
+                <w:b w:val="0"/>
+                <w:sz w:val="19"/>
+              </w:rPr>
+              <w:t>A certificate that is commercially in force: Client Approved - Paid, Client Approved - Confidential, or Republished, inside its certification period</w:t>
+            </w:r>
+          </w:p>
+        </w:tc>
+      </w:tr>
+      <w:tr>
+        <w:tc>
+          <w:tcPr>
+            <w:tcW w:type="dxa" w:w="2045"/>
+          </w:tcPr>
+          <w:p>
+            <w:r/>
+            <w:r>
+              <w:rPr>
+                <w:b/>
+                <w:sz w:val="19"/>
+              </w:rPr>
+              <w:t>Certification #</w:t>
+            </w:r>
+          </w:p>
+        </w:tc>
+        <w:tc>
+          <w:tcPr>
+            <w:tcW w:type="dxa" w:w="6595"/>
+          </w:tcPr>
+          <w:p>
+            <w:r/>
+            <w:r>
+              <w:rPr>
+                <w:b w:val="0"/>
+                <w:sz w:val="19"/>
+              </w:rPr>
+              <w:t>The number identifying a certificate. Assigned by the system when the certificate is saved, never typed</w:t>
+            </w:r>
+          </w:p>
+        </w:tc>
+      </w:tr>
+      <w:tr>
+        <w:tc>
+          <w:tcPr>
+            <w:tcW w:type="dxa" w:w="2045"/>
+          </w:tcPr>
+          <w:p>
+            <w:r/>
+            <w:r>
+              <w:rPr>
+                <w:b/>
+                <w:sz w:val="19"/>
+              </w:rPr>
+              <w:t>Certification period</w:t>
+            </w:r>
+          </w:p>
+        </w:tc>
+        <w:tc>
+          <w:tcPr>
+            <w:tcW w:type="dxa" w:w="6595"/>
+          </w:tcPr>
+          <w:p>
+            <w:r/>
+            <w:r>
+              <w:rPr>
+                <w:b w:val="0"/>
+                <w:sz w:val="19"/>
+              </w:rPr>
+              <w:t>The span from the effective date to the expiration date, inclusive of both</w:t>
+            </w:r>
+          </w:p>
+        </w:tc>
+      </w:tr>
+      <w:tr>
+        <w:tc>
+          <w:tcPr>
+            <w:tcW w:type="dxa" w:w="2045"/>
+          </w:tcPr>
+          <w:p>
+            <w:r/>
+            <w:r>
+              <w:rPr>
+                <w:b/>
+                <w:sz w:val="19"/>
+              </w:rPr>
+              <w:t>Certification Results</w:t>
+            </w:r>
+          </w:p>
+        </w:tc>
+        <w:tc>
+          <w:tcPr>
+            <w:tcW w:type="dxa" w:w="6595"/>
+          </w:tcPr>
+          <w:p>
+            <w:r/>
+            <w:r>
+              <w:rPr>
+                <w:b w:val="0"/>
+                <w:sz w:val="19"/>
+              </w:rPr>
+              <w:t>Free text recorded against a certificate, shown exactly as it was entered. Required for Amazon CPF certificates</w:t>
+            </w:r>
+          </w:p>
+        </w:tc>
+      </w:tr>
+      <w:tr>
+        <w:tc>
+          <w:tcPr>
+            <w:tcW w:type="dxa" w:w="2045"/>
+          </w:tcPr>
+          <w:p>
+            <w:r/>
+            <w:r>
+              <w:rPr>
+                <w:b/>
+                <w:sz w:val="19"/>
+              </w:rPr>
+              <w:t>Client Approved - Confidential</w:t>
+            </w:r>
+          </w:p>
+        </w:tc>
+        <w:tc>
+          <w:tcPr>
+            <w:tcW w:type="dxa" w:w="6595"/>
+          </w:tcPr>
+          <w:p>
+            <w:r/>
+            <w:r>
+              <w:rPr>
+                <w:b w:val="0"/>
+                <w:sz w:val="19"/>
+              </w:rPr>
+              <w:t>In force and badgeable, but deliberately withheld from the public database. An embargo, not a pause</w:t>
+            </w:r>
+          </w:p>
+        </w:tc>
+      </w:tr>
+      <w:tr>
+        <w:tc>
+          <w:tcPr>
+            <w:tcW w:type="dxa" w:w="2045"/>
+          </w:tcPr>
+          <w:p>
+            <w:r/>
+            <w:r>
+              <w:rPr>
+                <w:b/>
+                <w:sz w:val="19"/>
+              </w:rPr>
+              <w:t>Client Approved - Paid</w:t>
+            </w:r>
+          </w:p>
+        </w:tc>
+        <w:tc>
+          <w:tcPr>
+            <w:tcW w:type="dxa" w:w="6595"/>
+          </w:tcPr>
+          <w:p>
+            <w:r/>
+            <w:r>
+              <w:rPr>
+                <w:b w:val="0"/>
+                <w:sz w:val="19"/>
+              </w:rPr>
+              <w:t>In force and listed publicly</w:t>
+            </w:r>
+          </w:p>
+        </w:tc>
+      </w:tr>
+      <w:tr>
+        <w:tc>
+          <w:tcPr>
+            <w:tcW w:type="dxa" w:w="2045"/>
+          </w:tcPr>
+          <w:p>
+            <w:r/>
+            <w:r>
+              <w:rPr>
+                <w:b/>
+                <w:sz w:val="19"/>
+              </w:rPr>
+              <w:t>Company user</w:t>
+            </w:r>
+          </w:p>
+        </w:tc>
+        <w:tc>
+          <w:tcPr>
+            <w:tcW w:type="dxa" w:w="6595"/>
+          </w:tcPr>
+          <w:p>
+            <w:r/>
+            <w:r>
+              <w:rPr>
+                <w:b w:val="0"/>
+                <w:sz w:val="19"/>
+              </w:rPr>
+              <w:t xml:space="preserve">A person from a certified company, signing in to see their own company's certificates. The role is named </w:t>
+            </w:r>
+            <w:r>
+              <w:rPr>
+                <w:b/>
+                <w:sz w:val="19"/>
+              </w:rPr>
+              <w:t>External</w:t>
+            </w:r>
+          </w:p>
+        </w:tc>
+      </w:tr>
+      <w:tr>
+        <w:tc>
+          <w:tcPr>
+            <w:tcW w:type="dxa" w:w="2045"/>
+          </w:tcPr>
+          <w:p>
+            <w:r/>
+            <w:r>
+              <w:rPr>
+                <w:b/>
+                <w:sz w:val="19"/>
+              </w:rPr>
+              <w:t>CPF</w:t>
+            </w:r>
+          </w:p>
+        </w:tc>
+        <w:tc>
+          <w:tcPr>
+            <w:tcW w:type="dxa" w:w="6595"/>
+          </w:tcPr>
+          <w:p>
+            <w:r/>
+            <w:r>
+              <w:rPr>
+                <w:b w:val="0"/>
+                <w:sz w:val="19"/>
+              </w:rPr>
+              <w:t>Amazon's Climate Pledge Friendly programme</w:t>
+            </w:r>
+          </w:p>
+        </w:tc>
+      </w:tr>
+      <w:tr>
+        <w:tc>
+          <w:tcPr>
+            <w:tcW w:type="dxa" w:w="2045"/>
+          </w:tcPr>
+          <w:p>
+            <w:r/>
+            <w:r>
+              <w:rPr>
+                <w:b/>
+                <w:sz w:val="19"/>
+              </w:rPr>
+              <w:t>Database Listing URL</w:t>
+            </w:r>
+          </w:p>
+        </w:tc>
+        <w:tc>
+          <w:tcPr>
+            <w:tcW w:type="dxa" w:w="6595"/>
+          </w:tcPr>
+          <w:p>
+            <w:r/>
+            <w:r>
+              <w:rPr>
+                <w:b w:val="0"/>
+                <w:sz w:val="19"/>
+              </w:rPr>
+              <w:t>The public address of a single certificate, for sharing with someone who has no account</w:t>
+            </w:r>
+          </w:p>
+        </w:tc>
+      </w:tr>
+      <w:tr>
+        <w:tc>
+          <w:tcPr>
+            <w:tcW w:type="dxa" w:w="2045"/>
+          </w:tcPr>
+          <w:p>
+            <w:r/>
+            <w:r>
+              <w:rPr>
+                <w:b/>
+                <w:sz w:val="19"/>
+              </w:rPr>
+              <w:t>Effective date</w:t>
+            </w:r>
+          </w:p>
+        </w:tc>
+        <w:tc>
+          <w:tcPr>
+            <w:tcW w:type="dxa" w:w="6595"/>
+          </w:tcPr>
+          <w:p>
+            <w:r/>
+            <w:r>
+              <w:rPr>
+                <w:b w:val="0"/>
+                <w:sz w:val="19"/>
+              </w:rPr>
+              <w:t xml:space="preserve">The first day a certificate is in force. It is live </w:t>
+            </w:r>
+            <w:r>
+              <w:rPr>
+                <w:b/>
+                <w:sz w:val="19"/>
+              </w:rPr>
+              <w:t>on</w:t>
+            </w:r>
+            <w:r>
+              <w:rPr>
+                <w:b w:val="0"/>
+                <w:sz w:val="19"/>
+              </w:rPr>
+              <w:t xml:space="preserve"> this date</w:t>
+            </w:r>
+          </w:p>
+        </w:tc>
+      </w:tr>
+      <w:tr>
+        <w:tc>
+          <w:tcPr>
+            <w:tcW w:type="dxa" w:w="2045"/>
+          </w:tcPr>
+          <w:p>
+            <w:r/>
+            <w:r>
+              <w:rPr>
+                <w:b/>
+                <w:sz w:val="19"/>
+              </w:rPr>
+              <w:t>Expiration date</w:t>
+            </w:r>
+          </w:p>
+        </w:tc>
+        <w:tc>
+          <w:tcPr>
+            <w:tcW w:type="dxa" w:w="6595"/>
+          </w:tcPr>
+          <w:p>
+            <w:r/>
+            <w:r>
+              <w:rPr>
+                <w:b w:val="0"/>
+                <w:sz w:val="19"/>
+              </w:rPr>
+              <w:t xml:space="preserve">The last day a certificate is in force. It is live </w:t>
+            </w:r>
+            <w:r>
+              <w:rPr>
+                <w:b/>
+                <w:sz w:val="19"/>
+              </w:rPr>
+              <w:t>through</w:t>
+            </w:r>
+            <w:r>
+              <w:rPr>
+                <w:b w:val="0"/>
+                <w:sz w:val="19"/>
+              </w:rPr>
+              <w:t xml:space="preserve"> this date and expires the day after</w:t>
+            </w:r>
+          </w:p>
+        </w:tc>
+      </w:tr>
+      <w:tr>
+        <w:tc>
+          <w:tcPr>
+            <w:tcW w:type="dxa" w:w="2045"/>
+          </w:tcPr>
+          <w:p>
+            <w:r/>
+            <w:r>
+              <w:rPr>
+                <w:b/>
+                <w:sz w:val="19"/>
+              </w:rPr>
+              <w:t>External tag</w:t>
+            </w:r>
+          </w:p>
+        </w:tc>
+        <w:tc>
+          <w:tcPr>
+            <w:tcW w:type="dxa" w:w="6595"/>
+          </w:tcPr>
+          <w:p>
+            <w:r/>
+            <w:r>
+              <w:rPr>
+                <w:b w:val="0"/>
+                <w:sz w:val="19"/>
+              </w:rPr>
+              <w:t>A tag visible to company and partner accounts and on public surfaces</w:t>
+            </w:r>
+          </w:p>
+        </w:tc>
+      </w:tr>
+      <w:tr>
+        <w:tc>
+          <w:tcPr>
+            <w:tcW w:type="dxa" w:w="2045"/>
+          </w:tcPr>
+          <w:p>
+            <w:r/>
+            <w:r>
+              <w:rPr>
+                <w:b/>
+                <w:sz w:val="19"/>
+              </w:rPr>
+              <w:t>GTIN · EAN · UPC</w:t>
+            </w:r>
+          </w:p>
+        </w:tc>
+        <w:tc>
+          <w:tcPr>
+            <w:tcW w:type="dxa" w:w="6595"/>
+          </w:tcPr>
+          <w:p>
+            <w:r/>
+            <w:r>
+              <w:rPr>
+                <w:b w:val="0"/>
+                <w:sz w:val="19"/>
+              </w:rPr>
+              <w:t>Product identifiers recorded against a certificate alongside ASIN</w:t>
+            </w:r>
+          </w:p>
+        </w:tc>
+      </w:tr>
+      <w:tr>
+        <w:tc>
+          <w:tcPr>
+            <w:tcW w:type="dxa" w:w="2045"/>
+          </w:tcPr>
+          <w:p>
+            <w:r/>
+            <w:r>
+              <w:rPr>
+                <w:b/>
+                <w:sz w:val="19"/>
+              </w:rPr>
+              <w:t>Internal tag</w:t>
+            </w:r>
+          </w:p>
+        </w:tc>
+        <w:tc>
+          <w:tcPr>
+            <w:tcW w:type="dxa" w:w="6595"/>
+          </w:tcPr>
+          <w:p>
+            <w:r/>
+            <w:r>
+              <w:rPr>
+                <w:b w:val="0"/>
+                <w:sz w:val="19"/>
+              </w:rPr>
+              <w:t>A tag visible only to GreenCircle staff. Never shown to a company or partner account</w:t>
+            </w:r>
+          </w:p>
+        </w:tc>
+      </w:tr>
+      <w:tr>
+        <w:tc>
+          <w:tcPr>
+            <w:tcW w:type="dxa" w:w="2045"/>
+          </w:tcPr>
+          <w:p>
+            <w:r/>
+            <w:r>
+              <w:rPr>
+                <w:b/>
+                <w:sz w:val="19"/>
+              </w:rPr>
+              <w:t>Partner</w:t>
+            </w:r>
+          </w:p>
+        </w:tc>
+        <w:tc>
+          <w:tcPr>
+            <w:tcW w:type="dxa" w:w="6595"/>
+          </w:tcPr>
+          <w:p>
+            <w:r/>
+            <w:r>
+              <w:rPr>
+                <w:b w:val="0"/>
+                <w:sz w:val="19"/>
+              </w:rPr>
+              <w:t>A role for a partner organisation, scoped to the certificates associated with that partner</w:t>
+            </w:r>
+          </w:p>
+        </w:tc>
+      </w:tr>
+      <w:tr>
+        <w:tc>
+          <w:tcPr>
+            <w:tcW w:type="dxa" w:w="2045"/>
+          </w:tcPr>
+          <w:p>
+            <w:r/>
+            <w:r>
+              <w:rPr>
+                <w:b/>
+                <w:sz w:val="19"/>
+              </w:rPr>
+              <w:t>Pathway</w:t>
+            </w:r>
+          </w:p>
+        </w:tc>
+        <w:tc>
+          <w:tcPr>
+            <w:tcW w:type="dxa" w:w="6595"/>
+          </w:tcPr>
+          <w:p>
+            <w:r/>
+            <w:r>
+              <w:rPr>
+                <w:b w:val="0"/>
+                <w:sz w:val="19"/>
+              </w:rPr>
+              <w:t>An optional certification pathway on a certificate, used for Amazon CPF</w:t>
+            </w:r>
+          </w:p>
+        </w:tc>
+      </w:tr>
+      <w:tr>
+        <w:tc>
+          <w:tcPr>
+            <w:tcW w:type="dxa" w:w="2045"/>
+          </w:tcPr>
+          <w:p>
+            <w:r/>
+            <w:r>
+              <w:rPr>
+                <w:b/>
+                <w:sz w:val="19"/>
+              </w:rPr>
+              <w:t>Product category · type · subcategory</w:t>
+            </w:r>
+          </w:p>
+        </w:tc>
+        <w:tc>
+          <w:tcPr>
+            <w:tcW w:type="dxa" w:w="6595"/>
+          </w:tcPr>
+          <w:p>
+            <w:r/>
+            <w:r>
+              <w:rPr>
+                <w:b w:val="0"/>
+                <w:sz w:val="19"/>
+              </w:rPr>
+              <w:t>The three levels of the product hierarchy. The category must exist before a product can use it</w:t>
+            </w:r>
+          </w:p>
+        </w:tc>
+      </w:tr>
+      <w:tr>
+        <w:tc>
+          <w:tcPr>
+            <w:tcW w:type="dxa" w:w="2045"/>
+          </w:tcPr>
+          <w:p>
+            <w:r/>
+            <w:r>
+              <w:rPr>
+                <w:b/>
+                <w:sz w:val="19"/>
+              </w:rPr>
+              <w:t>Public</w:t>
+            </w:r>
+          </w:p>
+        </w:tc>
+        <w:tc>
+          <w:tcPr>
+            <w:tcW w:type="dxa" w:w="6595"/>
+          </w:tcPr>
+          <w:p>
+            <w:r/>
+            <w:r>
+              <w:rPr>
+                <w:b w:val="0"/>
+                <w:sz w:val="19"/>
+              </w:rPr>
+              <w:t>The anonymous public directory. No account is needed</w:t>
+            </w:r>
+          </w:p>
+        </w:tc>
+      </w:tr>
+      <w:tr>
+        <w:tc>
+          <w:tcPr>
+            <w:tcW w:type="dxa" w:w="2045"/>
+          </w:tcPr>
+          <w:p>
+            <w:r/>
+            <w:r>
+              <w:rPr>
+                <w:b/>
+                <w:sz w:val="19"/>
+              </w:rPr>
+              <w:t>Republished</w:t>
+            </w:r>
+          </w:p>
+        </w:tc>
+        <w:tc>
+          <w:tcPr>
+            <w:tcW w:type="dxa" w:w="6595"/>
+          </w:tcPr>
+          <w:p>
+            <w:r/>
+            <w:r>
+              <w:rPr>
+                <w:b w:val="0"/>
+                <w:sz w:val="19"/>
+              </w:rPr>
+              <w:t>A certificate re-issued with a fresh certification period. In force and listed publicly</w:t>
+            </w:r>
+          </w:p>
+        </w:tc>
+      </w:tr>
+    </w:tbl>
+    <w:p>
+      <w:pPr>
+        <w:spacing w:after="120"/>
+      </w:pPr>
+    </w:p>
+    <w:p>
+      <w:pPr>
+        <w:pStyle w:val="Heading1"/>
+      </w:pPr>
+      <w:r>
+        <w:t>Getting help</w:t>
+      </w:r>
+    </w:p>
+    <w:p>
+      <w:r>
+        <w:rPr>
+          <w:b w:val="0"/>
+        </w:rPr>
+        <w:t>Before contacting anyone, three things resolve most problems on their own.</w:t>
+      </w:r>
+    </w:p>
+    <w:p>
+      <w:pPr>
+        <w:pStyle w:val="ListNumber"/>
+        <w:spacing w:after="80"/>
+      </w:pPr>
+      <w:r>
+        <w:rPr>
+          <w:b/>
+        </w:rPr>
+        <w:t>Check this guide's contents.</w:t>
+      </w:r>
+      <w:r>
+        <w:rPr>
+          <w:b w:val="0"/>
+        </w:rPr>
+        <w:t xml:space="preserve"> The answer is often in another section — the troubleshooting table in particular lists the symptoms that have actually been reported.</w:t>
+      </w:r>
+    </w:p>
+    <w:p>
+      <w:pPr>
+        <w:pStyle w:val="ListNumber"/>
+        <w:spacing w:after="80"/>
+      </w:pPr>
+      <w:r>
+        <w:rPr>
+          <w:b/>
+        </w:rPr>
+        <w:t>Sign out and sign back in.</w:t>
+      </w:r>
+      <w:r>
+        <w:rPr>
+          <w:b w:val="0"/>
+        </w:rPr>
+        <w:t xml:space="preserve"> This clears anything left over from an interrupted session.</w:t>
+      </w:r>
+    </w:p>
+    <w:p>
+      <w:pPr>
+        <w:pStyle w:val="ListNumber"/>
+        <w:spacing w:after="80"/>
+      </w:pPr>
+      <w:r>
+        <w:rPr>
+          <w:b/>
+        </w:rPr>
+        <w:t>Reload the page.</w:t>
+      </w:r>
+      <w:r>
+        <w:rPr>
+          <w:b w:val="0"/>
+        </w:rPr>
+        <w:t xml:space="preserve"> If the site has been updated recently, a reload picks up the new version.</w:t>
+      </w:r>
+    </w:p>
+    <w:p>
+      <w:r>
+        <w:rPr>
+          <w:b w:val="0"/>
+        </w:rPr>
+        <w:t>If the problem persists, report it with these five details. They are what makes a problem reproducible rather than a description of a feeling.</w:t>
+      </w:r>
+    </w:p>
+    <w:tbl>
+      <w:tblPr>
+        <w:tblStyle w:val="LightGrid-Accent3"/>
+        <w:tblW w:type="auto" w:w="0"/>
+        <w:jc w:val="left"/>
+        <w:tblLook w:firstColumn="1" w:firstRow="1" w:lastColumn="0" w:lastRow="0" w:noHBand="0" w:noVBand="1" w:val="04A0"/>
+      </w:tblPr>
+      <w:tblGrid>
+        <w:gridCol w:w="4680"/>
+        <w:gridCol w:w="4680"/>
+      </w:tblGrid>
+      <w:tr>
+        <w:tc>
+          <w:tcPr>
+            <w:tcW w:type="dxa" w:w="3110"/>
+          </w:tcPr>
+          <w:p>
+            <w:r/>
+            <w:r>
+              <w:rPr>
+                <w:b/>
+                <w:sz w:val="18"/>
+              </w:rPr>
+              <w:t>Include</w:t>
+            </w:r>
+          </w:p>
+        </w:tc>
+        <w:tc>
+          <w:tcPr>
+            <w:tcW w:type="dxa" w:w="5530"/>
+          </w:tcPr>
+          <w:p>
+            <w:r/>
+            <w:r>
+              <w:rPr>
+                <w:b/>
+                <w:sz w:val="18"/>
+              </w:rPr>
+              <w:t>Example</w:t>
+            </w:r>
+          </w:p>
+        </w:tc>
+      </w:tr>
+      <w:tr>
+        <w:tc>
+          <w:tcPr>
+            <w:tcW w:type="dxa" w:w="3110"/>
+          </w:tcPr>
+          <w:p>
+            <w:r/>
+            <w:r>
+              <w:rPr>
+                <w:b w:val="0"/>
+                <w:sz w:val="19"/>
+              </w:rPr>
+              <w:t>What you were trying to do</w:t>
+            </w:r>
+          </w:p>
+        </w:tc>
+        <w:tc>
+          <w:tcPr>
+            <w:tcW w:type="dxa" w:w="5530"/>
+          </w:tcPr>
+          <w:p>
+            <w:r/>
+            <w:r>
+              <w:rPr>
+                <w:b w:val="0"/>
+                <w:sz w:val="19"/>
+              </w:rPr>
+              <w:t>"Upload a certificate for a new product"</w:t>
+            </w:r>
+          </w:p>
+        </w:tc>
+      </w:tr>
+      <w:tr>
+        <w:tc>
+          <w:tcPr>
+            <w:tcW w:type="dxa" w:w="3110"/>
+          </w:tcPr>
+          <w:p>
+            <w:r/>
+            <w:r>
+              <w:rPr>
+                <w:b w:val="0"/>
+                <w:sz w:val="19"/>
+              </w:rPr>
+              <w:t>What happened instead</w:t>
+            </w:r>
+          </w:p>
+        </w:tc>
+        <w:tc>
+          <w:tcPr>
+            <w:tcW w:type="dxa" w:w="5530"/>
+          </w:tcPr>
+          <w:p>
+            <w:r/>
+            <w:r>
+              <w:rPr>
+                <w:b w:val="0"/>
+                <w:sz w:val="19"/>
+              </w:rPr>
+              <w:t>The exact wording of any message on screen</w:t>
+            </w:r>
+          </w:p>
+        </w:tc>
+      </w:tr>
+      <w:tr>
+        <w:tc>
+          <w:tcPr>
+            <w:tcW w:type="dxa" w:w="3110"/>
+          </w:tcPr>
+          <w:p>
+            <w:r/>
+            <w:r>
+              <w:rPr>
+                <w:b w:val="0"/>
+                <w:sz w:val="19"/>
+              </w:rPr>
+              <w:t>The certificate number</w:t>
+            </w:r>
+          </w:p>
+        </w:tc>
+        <w:tc>
+          <w:tcPr>
+            <w:tcW w:type="dxa" w:w="5530"/>
+          </w:tcPr>
+          <w:p>
+            <w:r/>
+            <w:r>
+              <w:rPr>
+                <w:b w:val="0"/>
+                <w:sz w:val="19"/>
+              </w:rPr>
+              <w:t>If the problem concerns a particular certificate</w:t>
+            </w:r>
+          </w:p>
+        </w:tc>
+      </w:tr>
+      <w:tr>
+        <w:tc>
+          <w:tcPr>
+            <w:tcW w:type="dxa" w:w="3110"/>
+          </w:tcPr>
+          <w:p>
+            <w:r/>
+            <w:r>
+              <w:rPr>
+                <w:b w:val="0"/>
+                <w:sz w:val="19"/>
+              </w:rPr>
+              <w:t>Browser and device</w:t>
+            </w:r>
+          </w:p>
+        </w:tc>
+        <w:tc>
+          <w:tcPr>
+            <w:tcW w:type="dxa" w:w="5530"/>
+          </w:tcPr>
+          <w:p>
+            <w:r/>
+            <w:r>
+              <w:rPr>
+                <w:b w:val="0"/>
+                <w:sz w:val="19"/>
+              </w:rPr>
+              <w:t>"Chrome on Windows 11", "Safari on an iPad"</w:t>
+            </w:r>
+          </w:p>
+        </w:tc>
+      </w:tr>
+      <w:tr>
+        <w:tc>
+          <w:tcPr>
+            <w:tcW w:type="dxa" w:w="3110"/>
+          </w:tcPr>
+          <w:p>
+            <w:r/>
+            <w:r>
+              <w:rPr>
+                <w:b w:val="0"/>
+                <w:sz w:val="19"/>
+              </w:rPr>
+              <w:t>Roughly when</w:t>
+            </w:r>
+          </w:p>
+        </w:tc>
+        <w:tc>
+          <w:tcPr>
+            <w:tcW w:type="dxa" w:w="5530"/>
+          </w:tcPr>
+          <w:p>
+            <w:r/>
+            <w:r>
+              <w:rPr>
+                <w:b w:val="0"/>
+                <w:sz w:val="19"/>
+              </w:rPr>
+              <w:t>The date and approximate time, so the event can be found</w:t>
+            </w:r>
+          </w:p>
+        </w:tc>
+      </w:tr>
+    </w:tbl>
+    <w:p>
+      <w:pPr>
+        <w:spacing w:after="120"/>
+      </w:pPr>
+    </w:p>
+    <w:p>
+      <w:r>
+        <w:rPr>
+          <w:b w:val="0"/>
+        </w:rPr>
+        <w:t>A screenshot of the whole browser window, including the address bar, is worth all five.</w:t>
       </w:r>
     </w:p>
     <w:p>

</xml_diff>